<commit_message>
chore: preserve legal RAG and local evaluation before isolated corpus rebuild
</commit_message>
<xml_diff>
--- a/Data/water_cantho/Quyết-định-215-QĐ-UBND.docx
+++ b/Data/water_cantho/Quyết-định-215-QĐ-UBND.docx
@@ -217,6 +217,139 @@
       </w:tr>
       <w:bookmarkEnd w:id="0"/>
     </w:tbl>
+    <w:p>
+      <w:pPr>
+        <w:spacing w:after="20"/>
+      </w:pPr>
+      <w:r>
+        <w:rPr>
+          <w:b/>
+          <w:color w:val="1F4E79"/>
+          <w:sz w:val="18"/>
+        </w:rPr>
+        <w:t>GHI CHÚ NGỮ CẢNH — PHẦN BIÊN TẬP, KHÔNG THUỘC NGUYÊN VĂN VĂN BẢN</w:t>
+      </w:r>
+    </w:p>
+    <w:p>
+      <w:r>
+        <w:rPr>
+          <w:b/>
+          <w:sz w:val="18"/>
+        </w:rPr>
+        <w:t>Văn bản: GIÁ NƯỚC SẠCH SINH HOẠT CẦN THƠ — 215/QĐ-UBND</w:t>
+      </w:r>
+    </w:p>
+    <w:p>
+      <w:pPr>
+        <w:spacing w:after="0" w:line="240" w:lineRule="auto"/>
+      </w:pPr>
+      <w:r>
+        <w:rPr>
+          <w:b/>
+          <w:color w:val="464646"/>
+          <w:sz w:val="17"/>
+        </w:rPr>
+        <w:t xml:space="preserve">Định danh: </w:t>
+      </w:r>
+      <w:r>
+        <w:rPr>
+          <w:color w:val="464646"/>
+          <w:sz w:val="17"/>
+        </w:rPr>
+        <w:t>Quyết định số 215/QĐ-UBND của UBND thành phố Cần Thơ, ngày 01/02/2024.</w:t>
+      </w:r>
+    </w:p>
+    <w:p>
+      <w:pPr>
+        <w:spacing w:after="0" w:line="240" w:lineRule="auto"/>
+      </w:pPr>
+      <w:r>
+        <w:rPr>
+          <w:b/>
+          <w:color w:val="464646"/>
+          <w:sz w:val="17"/>
+        </w:rPr>
+        <w:t xml:space="preserve">Phạm vi/đối tượng: </w:t>
+      </w:r>
+      <w:r>
+        <w:rPr>
+          <w:color w:val="464646"/>
+          <w:sz w:val="17"/>
+        </w:rPr>
+        <w:t>Quy định giá nước sạch sinh hoạt theo nhóm khách hàng/khu vực đô thị và nông thôn thuộc phạm vi quyết định; áp dụng với đơn vị cấp nước và khách hàng liên quan.</w:t>
+      </w:r>
+    </w:p>
+    <w:p>
+      <w:pPr>
+        <w:spacing w:after="0" w:line="240" w:lineRule="auto"/>
+      </w:pPr>
+      <w:r>
+        <w:rPr>
+          <w:b/>
+          <w:color w:val="464646"/>
+          <w:sz w:val="17"/>
+        </w:rPr>
+        <w:t xml:space="preserve">Hiệu lực: </w:t>
+      </w:r>
+      <w:r>
+        <w:rPr>
+          <w:color w:val="464646"/>
+          <w:sz w:val="17"/>
+        </w:rPr>
+        <w:t>Theo Điều 3, kể từ ngày ký 01/02/2024.</w:t>
+      </w:r>
+    </w:p>
+    <w:p>
+      <w:pPr>
+        <w:spacing w:after="0" w:line="240" w:lineRule="auto"/>
+      </w:pPr>
+      <w:r>
+        <w:rPr>
+          <w:b/>
+          <w:color w:val="464646"/>
+          <w:sz w:val="17"/>
+        </w:rPr>
+        <w:t xml:space="preserve">Lịch sử/ngữ cảnh: </w:t>
+      </w:r>
+      <w:r>
+        <w:rPr>
+          <w:color w:val="464646"/>
+          <w:sz w:val="17"/>
+        </w:rPr>
+        <w:t>Biểu giá là dữ liệu địa phương có thể thay đổi. Khi trả lời về giá hiện tại, kiểm tra đơn vị cấp nước và văn bản giá mới; do địa giới Cần Thơ thay đổi năm 2025, không tự suy rộng biểu giá cũ cho toàn bộ địa bàn thành phố hiện nay. Theo Nghị quyết 202/2025/QH15, địa giới thành phố đã được sắp xếp lại từ 01/07/2025.</w:t>
+      </w:r>
+    </w:p>
+    <w:p>
+      <w:pPr>
+        <w:spacing w:after="0" w:line="240" w:lineRule="auto"/>
+      </w:pPr>
+      <w:r>
+        <w:rPr>
+          <w:b/>
+          <w:color w:val="464646"/>
+          <w:sz w:val="17"/>
+        </w:rPr>
+        <w:t xml:space="preserve">Nguồn chính thức: </w:t>
+      </w:r>
+      <w:r>
+        <w:rPr>
+          <w:color w:val="464646"/>
+          <w:sz w:val="17"/>
+        </w:rPr>
+        <w:t>Cổng Thông tin điện tử Cần Thơ, thông tin công bố Quyết định số 215/QĐ-UBND ngày 01/02/2024 (đối chiếu theo số hiệu và ngày văn bản; trang công bố chính thức được dẫn trong báo cáo kiểm tra).</w:t>
+      </w:r>
+    </w:p>
+    <w:p>
+      <w:pPr>
+        <w:spacing w:after="40"/>
+      </w:pPr>
+      <w:r>
+        <w:rPr>
+          <w:sz w:val="14"/>
+        </w:rPr>
+        <w:t>————————————————————————————————————————————————————</w:t>
+      </w:r>
+    </w:p>
     <w:p>
       <w:pPr>
         <w:jc w:val="center"/>

</xml_diff>